<commit_message>
Re-price the KritiLabs proposal for 1,000 calls a day
Co-Authored-By: Claude Fable 5.1 <noreply@anthropic.com>
Claude-Session: https://claude.ai/code/session_01RiTsdM6K46HbTGVR4HVBpm
</commit_message>
<xml_diff>
--- a/docs/gtm/Decibyl-Proposal-KritiLabs-Elock.docx
+++ b/docs/gtm/Decibyl-Proposal-KritiLabs-Elock.docx
@@ -2534,7 +2534,349 @@
         <w:spacing w:after="160" w:before="360"/>
       </w:pPr>
       <w:r>
-        <w:t xml:space="preserve">6. Plan and timeline</w:t>
+        <w:t xml:space="preserve">6. Volume: 1,000 calls a day</w:t>
+      </w:r>
+    </w:p>
+    <w:p>
+      <w:pPr>
+        <w:spacing w:after="120" w:line="300"/>
+      </w:pPr>
+      <w:r>
+        <w:rPr>
+          <w:rFonts w:ascii="Calibri" w:cs="Calibri" w:eastAsia="Calibri" w:hAnsi="Calibri"/>
+          <w:color w:val="1F1F1F"/>
+          <w:sz w:val="21"/>
+          <w:szCs w:val="21"/>
+        </w:rPr>
+        <w:t xml:space="preserve">You told us to size for 1,000 calls a day, about 30,000 a month. These flows are long: authentication, a key press, a wait for an OTP, another key press. We model 4 minutes per call on average, 3 to 6 in practice, which is 90,000 to 180,000 minutes a month. Three things follow.</w:t>
+      </w:r>
+    </w:p>
+    <w:tbl>
+      <w:tblPr>
+        <w:tblW w:type="dxa" w:w="9360"/>
+        <w:tblBorders>
+          <w:top w:val="single" w:color="auto" w:sz="4"/>
+          <w:left w:val="single" w:color="auto" w:sz="4"/>
+          <w:bottom w:val="single" w:color="auto" w:sz="4"/>
+          <w:right w:val="single" w:color="auto" w:sz="4"/>
+          <w:insideH w:val="single" w:color="auto" w:sz="4"/>
+          <w:insideV w:val="single" w:color="auto" w:sz="4"/>
+        </w:tblBorders>
+      </w:tblPr>
+      <w:tblGrid>
+        <w:gridCol w:w="2800"/>
+        <w:gridCol w:w="6560"/>
+      </w:tblGrid>
+      <w:tr>
+        <w:trPr>
+          <w:tblHeader/>
+        </w:trPr>
+        <w:tc>
+          <w:tcPr>
+            <w:tcW w:type="dxa" w:w="2800"/>
+            <w:tcBorders>
+              <w:top w:val="single" w:color="E3DAD5" w:sz="4"/>
+              <w:left w:val="single" w:color="E3DAD5" w:sz="4"/>
+              <w:bottom w:val="single" w:color="E3DAD5" w:sz="4"/>
+              <w:right w:val="single" w:color="E3DAD5" w:sz="4"/>
+            </w:tcBorders>
+            <w:shd w:fill="E8562A" w:color="auto" w:val="clear"/>
+            <w:tcMar>
+              <w:top w:type="dxa" w:w="80"/>
+              <w:left w:type="dxa" w:w="120"/>
+              <w:bottom w:type="dxa" w:w="80"/>
+              <w:right w:type="dxa" w:w="120"/>
+            </w:tcMar>
+          </w:tcPr>
+          <w:p>
+            <w:pPr>
+              <w:spacing w:after="0" w:line="276"/>
+            </w:pPr>
+            <w:r>
+              <w:rPr>
+                <w:rFonts w:ascii="Calibri" w:cs="Calibri" w:eastAsia="Calibri" w:hAnsi="Calibri"/>
+                <w:b/>
+                <w:bCs/>
+                <w:color w:val="FFFFFF"/>
+                <w:sz w:val="19"/>
+                <w:szCs w:val="19"/>
+              </w:rPr>
+              <w:t xml:space="preserve">Question</w:t>
+            </w:r>
+          </w:p>
+        </w:tc>
+        <w:tc>
+          <w:tcPr>
+            <w:tcW w:type="dxa" w:w="6560"/>
+            <w:tcBorders>
+              <w:top w:val="single" w:color="E3DAD5" w:sz="4"/>
+              <w:left w:val="single" w:color="E3DAD5" w:sz="4"/>
+              <w:bottom w:val="single" w:color="E3DAD5" w:sz="4"/>
+              <w:right w:val="single" w:color="E3DAD5" w:sz="4"/>
+            </w:tcBorders>
+            <w:shd w:fill="E8562A" w:color="auto" w:val="clear"/>
+            <w:tcMar>
+              <w:top w:type="dxa" w:w="80"/>
+              <w:left w:type="dxa" w:w="120"/>
+              <w:bottom w:type="dxa" w:w="80"/>
+              <w:right w:type="dxa" w:w="120"/>
+            </w:tcMar>
+          </w:tcPr>
+          <w:p>
+            <w:pPr>
+              <w:spacing w:after="0" w:line="276"/>
+            </w:pPr>
+            <w:r>
+              <w:rPr>
+                <w:rFonts w:ascii="Calibri" w:cs="Calibri" w:eastAsia="Calibri" w:hAnsi="Calibri"/>
+                <w:b/>
+                <w:bCs/>
+                <w:color w:val="FFFFFF"/>
+                <w:sz w:val="19"/>
+                <w:szCs w:val="19"/>
+              </w:rPr>
+              <w:t xml:space="preserve">Answer</w:t>
+            </w:r>
+          </w:p>
+        </w:tc>
+      </w:tr>
+      <w:tr>
+        <w:trPr>
+          <w:tblHeader w:val="false"/>
+        </w:trPr>
+        <w:tc>
+          <w:tcPr>
+            <w:tcW w:type="dxa" w:w="2800"/>
+            <w:tcBorders>
+              <w:top w:val="single" w:color="E3DAD5" w:sz="4"/>
+              <w:left w:val="single" w:color="E3DAD5" w:sz="4"/>
+              <w:bottom w:val="single" w:color="E3DAD5" w:sz="4"/>
+              <w:right w:val="single" w:color="E3DAD5" w:sz="4"/>
+            </w:tcBorders>
+            <w:tcMar>
+              <w:top w:type="dxa" w:w="80"/>
+              <w:left w:type="dxa" w:w="120"/>
+              <w:bottom w:type="dxa" w:w="80"/>
+              <w:right w:type="dxa" w:w="120"/>
+            </w:tcMar>
+          </w:tcPr>
+          <w:p>
+            <w:pPr>
+              <w:spacing w:after="0" w:line="276"/>
+            </w:pPr>
+            <w:r>
+              <w:rPr>
+                <w:rFonts w:ascii="Calibri" w:cs="Calibri" w:eastAsia="Calibri" w:hAnsi="Calibri"/>
+                <w:b w:val="false"/>
+                <w:bCs w:val="false"/>
+                <w:color w:val="1F1F1F"/>
+                <w:sz w:val="19"/>
+                <w:szCs w:val="19"/>
+              </w:rPr>
+              <w:t xml:space="preserve">Can the platform carry it?</w:t>
+            </w:r>
+          </w:p>
+        </w:tc>
+        <w:tc>
+          <w:tcPr>
+            <w:tcW w:type="dxa" w:w="6560"/>
+            <w:tcBorders>
+              <w:top w:val="single" w:color="E3DAD5" w:sz="4"/>
+              <w:left w:val="single" w:color="E3DAD5" w:sz="4"/>
+              <w:bottom w:val="single" w:color="E3DAD5" w:sz="4"/>
+              <w:right w:val="single" w:color="E3DAD5" w:sz="4"/>
+            </w:tcBorders>
+            <w:tcMar>
+              <w:top w:type="dxa" w:w="80"/>
+              <w:left w:type="dxa" w:w="120"/>
+              <w:bottom w:type="dxa" w:w="80"/>
+              <w:right w:type="dxa" w:w="120"/>
+            </w:tcMar>
+          </w:tcPr>
+          <w:p>
+            <w:pPr>
+              <w:spacing w:after="0" w:line="276"/>
+            </w:pPr>
+            <w:r>
+              <w:rPr>
+                <w:rFonts w:ascii="Calibri" w:cs="Calibri" w:eastAsia="Calibri" w:hAnsi="Calibri"/>
+                <w:b w:val="false"/>
+                <w:bCs w:val="false"/>
+                <w:color w:val="1F1F1F"/>
+                <w:sz w:val="19"/>
+                <w:szCs w:val="19"/>
+              </w:rPr>
+              <w:t xml:space="preserve">1,000 calls spread over a working day is about 60 an hour, 4 to 5 concurrent on average and 15 to 20 at peak. Decibyl's India fleet is planned for 40 concurrent conversations, so this fits with headroom. We run a synthetic load test at 2x your peak in week 2 and show you the latency numbers before go-live.</w:t>
+            </w:r>
+          </w:p>
+        </w:tc>
+      </w:tr>
+      <w:tr>
+        <w:trPr>
+          <w:tblHeader w:val="false"/>
+        </w:trPr>
+        <w:tc>
+          <w:tcPr>
+            <w:tcW w:type="dxa" w:w="2800"/>
+            <w:tcBorders>
+              <w:top w:val="single" w:color="E3DAD5" w:sz="4"/>
+              <w:left w:val="single" w:color="E3DAD5" w:sz="4"/>
+              <w:bottom w:val="single" w:color="E3DAD5" w:sz="4"/>
+              <w:right w:val="single" w:color="E3DAD5" w:sz="4"/>
+            </w:tcBorders>
+            <w:shd w:fill="FBEFE9" w:color="auto" w:val="clear"/>
+            <w:tcMar>
+              <w:top w:type="dxa" w:w="80"/>
+              <w:left w:type="dxa" w:w="120"/>
+              <w:bottom w:type="dxa" w:w="80"/>
+              <w:right w:type="dxa" w:w="120"/>
+            </w:tcMar>
+          </w:tcPr>
+          <w:p>
+            <w:pPr>
+              <w:spacing w:after="0" w:line="276"/>
+            </w:pPr>
+            <w:r>
+              <w:rPr>
+                <w:rFonts w:ascii="Calibri" w:cs="Calibri" w:eastAsia="Calibri" w:hAnsi="Calibri"/>
+                <w:b w:val="false"/>
+                <w:bCs w:val="false"/>
+                <w:color w:val="1F1F1F"/>
+                <w:sz w:val="19"/>
+                <w:szCs w:val="19"/>
+              </w:rPr>
+              <w:t xml:space="preserve">What does a human desk cost for the same?</w:t>
+            </w:r>
+          </w:p>
+        </w:tc>
+        <w:tc>
+          <w:tcPr>
+            <w:tcW w:type="dxa" w:w="6560"/>
+            <w:tcBorders>
+              <w:top w:val="single" w:color="E3DAD5" w:sz="4"/>
+              <w:left w:val="single" w:color="E3DAD5" w:sz="4"/>
+              <w:bottom w:val="single" w:color="E3DAD5" w:sz="4"/>
+              <w:right w:val="single" w:color="E3DAD5" w:sz="4"/>
+            </w:tcBorders>
+            <w:shd w:fill="FBEFE9" w:color="auto" w:val="clear"/>
+            <w:tcMar>
+              <w:top w:type="dxa" w:w="80"/>
+              <w:left w:type="dxa" w:w="120"/>
+              <w:bottom w:type="dxa" w:w="80"/>
+              <w:right w:type="dxa" w:w="120"/>
+            </w:tcMar>
+          </w:tcPr>
+          <w:p>
+            <w:pPr>
+              <w:spacing w:after="0" w:line="276"/>
+            </w:pPr>
+            <w:r>
+              <w:rPr>
+                <w:rFonts w:ascii="Calibri" w:cs="Calibri" w:eastAsia="Calibri" w:hAnsi="Calibri"/>
+                <w:b w:val="false"/>
+                <w:bCs w:val="false"/>
+                <w:color w:val="1F1F1F"/>
+                <w:sz w:val="19"/>
+                <w:szCs w:val="19"/>
+              </w:rPr>
+              <w:t xml:space="preserve">120,000 minutes a month is about 2,000 agent-hours, which is 13 to 14 people on a 24x7 rota, ₹4 to 5 lakh a month fully loaded, and still a queue at shift change. Most desks at this volume are understaffed, and a tanker waits.</w:t>
+            </w:r>
+          </w:p>
+        </w:tc>
+      </w:tr>
+      <w:tr>
+        <w:trPr>
+          <w:tblHeader w:val="false"/>
+        </w:trPr>
+        <w:tc>
+          <w:tcPr>
+            <w:tcW w:type="dxa" w:w="2800"/>
+            <w:tcBorders>
+              <w:top w:val="single" w:color="E3DAD5" w:sz="4"/>
+              <w:left w:val="single" w:color="E3DAD5" w:sz="4"/>
+              <w:bottom w:val="single" w:color="E3DAD5" w:sz="4"/>
+              <w:right w:val="single" w:color="E3DAD5" w:sz="4"/>
+            </w:tcBorders>
+            <w:tcMar>
+              <w:top w:type="dxa" w:w="80"/>
+              <w:left w:type="dxa" w:w="120"/>
+              <w:bottom w:type="dxa" w:w="80"/>
+              <w:right w:type="dxa" w:w="120"/>
+            </w:tcMar>
+          </w:tcPr>
+          <w:p>
+            <w:pPr>
+              <w:spacing w:after="0" w:line="276"/>
+            </w:pPr>
+            <w:r>
+              <w:rPr>
+                <w:rFonts w:ascii="Calibri" w:cs="Calibri" w:eastAsia="Calibri" w:hAnsi="Calibri"/>
+                <w:b w:val="false"/>
+                <w:bCs w:val="false"/>
+                <w:color w:val="1F1F1F"/>
+                <w:sz w:val="19"/>
+                <w:szCs w:val="19"/>
+              </w:rPr>
+              <w:t xml:space="preserve">How do we keep the per-minute cost down?</w:t>
+            </w:r>
+          </w:p>
+        </w:tc>
+        <w:tc>
+          <w:tcPr>
+            <w:tcW w:type="dxa" w:w="6560"/>
+            <w:tcBorders>
+              <w:top w:val="single" w:color="E3DAD5" w:sz="4"/>
+              <w:left w:val="single" w:color="E3DAD5" w:sz="4"/>
+              <w:bottom w:val="single" w:color="E3DAD5" w:sz="4"/>
+              <w:right w:val="single" w:color="E3DAD5" w:sz="4"/>
+            </w:tcBorders>
+            <w:tcMar>
+              <w:top w:type="dxa" w:w="80"/>
+              <w:left w:type="dxa" w:w="120"/>
+              <w:bottom w:type="dxa" w:w="80"/>
+              <w:right w:type="dxa" w:w="120"/>
+            </w:tcMar>
+          </w:tcPr>
+          <w:p>
+            <w:pPr>
+              <w:spacing w:after="0" w:line="276"/>
+            </w:pPr>
+            <w:r>
+              <w:rPr>
+                <w:rFonts w:ascii="Calibri" w:cs="Calibri" w:eastAsia="Calibri" w:hAnsi="Calibri"/>
+                <w:b w:val="false"/>
+                <w:bCs w:val="false"/>
+                <w:color w:val="1F1F1F"/>
+                <w:sz w:val="19"/>
+                <w:szCs w:val="19"/>
+              </w:rPr>
+              <w:t xml:space="preserve">The instructions in your flows are fixed text (press 6#, wait for the light, press 3#). We record those once per language with a real voice and play them back, so synthesis cost only applies to the dynamic parts. That roughly halves the speech cost of a call, and the scripted lines sound better than any synthesiser.</w:t>
+            </w:r>
+          </w:p>
+        </w:tc>
+      </w:tr>
+    </w:tbl>
+    <w:p>
+      <w:pPr>
+        <w:spacing w:after="120" w:line="300"/>
+      </w:pPr>
+      <w:r>
+        <w:rPr>
+          <w:rFonts w:ascii="Calibri" w:cs="Calibri" w:eastAsia="Calibri" w:hAnsi="Calibri"/>
+          <w:color w:val="1F1F1F"/>
+          <w:sz w:val="21"/>
+          <w:szCs w:val="21"/>
+        </w:rPr>
+        <w:t xml:space="preserve">At this volume the pilot in section 7 runs on ten percent of your traffic, about 100 calls a day, so the acceptance tests are run against real drivers before the number goes fully live.</w:t>
+      </w:r>
+    </w:p>
+    <w:p>
+      <w:pPr>
+        <w:pStyle w:val="Heading1"/>
+        <w:spacing w:after="160" w:before="360"/>
+      </w:pPr>
+      <w:r>
+        <w:t xml:space="preserve">7. Plan and timeline</w:t>
       </w:r>
     </w:p>
     <w:tbl>
@@ -2833,7 +3175,7 @@
                 <w:sz w:val="19"/>
                 <w:szCs w:val="19"/>
               </w:rPr>
-              <w:t xml:space="preserve">All five flows on staging; the test calls in section 4 run with your team on the line</w:t>
+              <w:t xml:space="preserve">All five flows on staging; the test calls in section 4 run with your team on the line; synthetic load test at 2x peak</w:t>
             </w:r>
           </w:p>
         </w:tc>
@@ -2867,7 +3209,7 @@
                 <w:sz w:val="19"/>
                 <w:szCs w:val="19"/>
               </w:rPr>
-              <w:t xml:space="preserve">Both; sign-off on the test sheet</w:t>
+              <w:t xml:space="preserve">Both; sign-off on the test sheet and the latency report</w:t>
             </w:r>
           </w:p>
         </w:tc>
@@ -2905,7 +3247,7 @@
                 <w:sz w:val="19"/>
                 <w:szCs w:val="19"/>
               </w:rPr>
-              <w:t xml:space="preserve">Week 3</w:t>
+              <w:t xml:space="preserve">Weeks 3 to 5</w:t>
             </w:r>
           </w:p>
         </w:tc>
@@ -2938,7 +3280,7 @@
                 <w:sz w:val="19"/>
                 <w:szCs w:val="19"/>
               </w:rPr>
-              <w:t xml:space="preserve">Production number live; call forwarding from your support line or a new published number; first week reviewed daily</w:t>
+              <w:t xml:space="preserve">Pilot: ten percent of live traffic (about 100 calls a day) routed to the agent; daily review of QA scores and escalations</w:t>
             </w:r>
           </w:p>
         </w:tc>
@@ -2971,7 +3313,7 @@
                 <w:sz w:val="19"/>
                 <w:szCs w:val="19"/>
               </w:rPr>
-              <w:t xml:space="preserve">Decibyl monitors; KritiLabs reviews QA scores</w:t>
+              <w:t xml:space="preserve">Decibyl monitors; KritiLabs reviews and signs off</w:t>
             </w:r>
           </w:p>
         </w:tc>
@@ -3010,6 +3352,112 @@
                 <w:sz w:val="19"/>
                 <w:szCs w:val="19"/>
               </w:rPr>
+              <w:t xml:space="preserve">Week 6</w:t>
+            </w:r>
+          </w:p>
+        </w:tc>
+        <w:tc>
+          <w:tcPr>
+            <w:tcW w:type="dxa" w:w="3600"/>
+            <w:tcBorders>
+              <w:top w:val="single" w:color="E3DAD5" w:sz="4"/>
+              <w:left w:val="single" w:color="E3DAD5" w:sz="4"/>
+              <w:bottom w:val="single" w:color="E3DAD5" w:sz="4"/>
+              <w:right w:val="single" w:color="E3DAD5" w:sz="4"/>
+            </w:tcBorders>
+            <w:shd w:fill="FBEFE9" w:color="auto" w:val="clear"/>
+            <w:tcMar>
+              <w:top w:type="dxa" w:w="80"/>
+              <w:left w:type="dxa" w:w="120"/>
+              <w:bottom w:type="dxa" w:w="80"/>
+              <w:right w:type="dxa" w:w="120"/>
+            </w:tcMar>
+          </w:tcPr>
+          <w:p>
+            <w:pPr>
+              <w:spacing w:after="0" w:line="276"/>
+            </w:pPr>
+            <w:r>
+              <w:rPr>
+                <w:rFonts w:ascii="Calibri" w:cs="Calibri" w:eastAsia="Calibri" w:hAnsi="Calibri"/>
+                <w:b w:val="false"/>
+                <w:bCs w:val="false"/>
+                <w:color w:val="1F1F1F"/>
+                <w:sz w:val="19"/>
+                <w:szCs w:val="19"/>
+              </w:rPr>
+              <w:t xml:space="preserve">Full traffic; 24x7 monitoring; on-call engineer for the first two weeks</w:t>
+            </w:r>
+          </w:p>
+        </w:tc>
+        <w:tc>
+          <w:tcPr>
+            <w:tcW w:type="dxa" w:w="3960"/>
+            <w:tcBorders>
+              <w:top w:val="single" w:color="E3DAD5" w:sz="4"/>
+              <w:left w:val="single" w:color="E3DAD5" w:sz="4"/>
+              <w:bottom w:val="single" w:color="E3DAD5" w:sz="4"/>
+              <w:right w:val="single" w:color="E3DAD5" w:sz="4"/>
+            </w:tcBorders>
+            <w:shd w:fill="FBEFE9" w:color="auto" w:val="clear"/>
+            <w:tcMar>
+              <w:top w:type="dxa" w:w="80"/>
+              <w:left w:type="dxa" w:w="120"/>
+              <w:bottom w:type="dxa" w:w="80"/>
+              <w:right w:type="dxa" w:w="120"/>
+            </w:tcMar>
+          </w:tcPr>
+          <w:p>
+            <w:pPr>
+              <w:spacing w:after="0" w:line="276"/>
+            </w:pPr>
+            <w:r>
+              <w:rPr>
+                <w:rFonts w:ascii="Calibri" w:cs="Calibri" w:eastAsia="Calibri" w:hAnsi="Calibri"/>
+                <w:b w:val="false"/>
+                <w:bCs w:val="false"/>
+                <w:color w:val="1F1F1F"/>
+                <w:sz w:val="19"/>
+                <w:szCs w:val="19"/>
+              </w:rPr>
+              <w:t xml:space="preserve">Decibyl</w:t>
+            </w:r>
+          </w:p>
+        </w:tc>
+      </w:tr>
+      <w:tr>
+        <w:trPr>
+          <w:tblHeader w:val="false"/>
+        </w:trPr>
+        <w:tc>
+          <w:tcPr>
+            <w:tcW w:type="dxa" w:w="1800"/>
+            <w:tcBorders>
+              <w:top w:val="single" w:color="E3DAD5" w:sz="4"/>
+              <w:left w:val="single" w:color="E3DAD5" w:sz="4"/>
+              <w:bottom w:val="single" w:color="E3DAD5" w:sz="4"/>
+              <w:right w:val="single" w:color="E3DAD5" w:sz="4"/>
+            </w:tcBorders>
+            <w:tcMar>
+              <w:top w:type="dxa" w:w="80"/>
+              <w:left w:type="dxa" w:w="120"/>
+              <w:bottom w:type="dxa" w:w="80"/>
+              <w:right w:type="dxa" w:w="120"/>
+            </w:tcMar>
+          </w:tcPr>
+          <w:p>
+            <w:pPr>
+              <w:spacing w:after="0" w:line="276"/>
+            </w:pPr>
+            <w:r>
+              <w:rPr>
+                <w:rFonts w:ascii="Calibri" w:cs="Calibri" w:eastAsia="Calibri" w:hAnsi="Calibri"/>
+                <w:b w:val="false"/>
+                <w:bCs w:val="false"/>
+                <w:color w:val="1F1F1F"/>
+                <w:sz w:val="19"/>
+                <w:szCs w:val="19"/>
+              </w:rPr>
               <w:t xml:space="preserve">Ongoing</w:t>
             </w:r>
           </w:p>
@@ -3023,7 +3471,6 @@
               <w:bottom w:val="single" w:color="E3DAD5" w:sz="4"/>
               <w:right w:val="single" w:color="E3DAD5" w:sz="4"/>
             </w:tcBorders>
-            <w:shd w:fill="FBEFE9" w:color="auto" w:val="clear"/>
             <w:tcMar>
               <w:top w:type="dxa" w:w="80"/>
               <w:left w:type="dxa" w:w="120"/>
@@ -3057,7 +3504,6 @@
               <w:bottom w:val="single" w:color="E3DAD5" w:sz="4"/>
               <w:right w:val="single" w:color="E3DAD5" w:sz="4"/>
             </w:tcBorders>
-            <w:shd w:fill="FBEFE9" w:color="auto" w:val="clear"/>
             <w:tcMar>
               <w:top w:type="dxa" w:w="80"/>
               <w:left w:type="dxa" w:w="120"/>
@@ -3090,7 +3536,7 @@
         <w:spacing w:after="160" w:before="360"/>
       </w:pPr>
       <w:r>
-        <w:t xml:space="preserve">7. Commercials</w:t>
+        <w:t xml:space="preserve">8. Commercials</w:t>
       </w:r>
     </w:p>
     <w:tbl>
@@ -3215,7 +3661,7 @@
                 <w:sz w:val="19"/>
                 <w:szCs w:val="19"/>
               </w:rPr>
-              <w:t xml:space="preserve">One-time setup: five flows, four API integrations, test sheet, live-agent transfer, go-live</w:t>
+              <w:t xml:space="preserve">One-time setup: five flows in three languages, four API integrations, pre-recorded instruction audio, load test, test sheet, live-agent transfer, go-live</w:t>
             </w:r>
           </w:p>
         </w:tc>
@@ -3248,7 +3694,7 @@
                 <w:sz w:val="19"/>
                 <w:szCs w:val="19"/>
               </w:rPr>
-              <w:t xml:space="preserve">₹30,000, invoiced at kick-off. Waived if the first six months are paid in advance.</w:t>
+              <w:t xml:space="preserve">₹75,000, invoiced at kick-off. Waived if the first six months are paid in advance.</w:t>
             </w:r>
           </w:p>
         </w:tc>
@@ -3287,7 +3733,7 @@
                 <w:sz w:val="19"/>
                 <w:szCs w:val="19"/>
               </w:rPr>
-              <w:t xml:space="preserve">Monthly service: the Elock support line, 24×7, Tamil / Hindi / English, recording, transcripts, QA scoring, weekly review</w:t>
+              <w:t xml:space="preserve">Pilot, weeks 3 to 5: ten percent of traffic, all five flows, daily review</w:t>
             </w:r>
           </w:p>
         </w:tc>
@@ -3321,7 +3767,7 @@
                 <w:sz w:val="19"/>
                 <w:szCs w:val="19"/>
               </w:rPr>
-              <w:t xml:space="preserve">₹15,000 per month, including 2,000 call minutes</w:t>
+              <w:t xml:space="preserve">₹50,000 flat, credited against the first full month</w:t>
             </w:r>
           </w:p>
         </w:tc>
@@ -3359,7 +3805,7 @@
                 <w:sz w:val="19"/>
                 <w:szCs w:val="19"/>
               </w:rPr>
-              <w:t xml:space="preserve">Usage beyond the included minutes</w:t>
+              <w:t xml:space="preserve">Committed volume: 100,000 minutes a month (about 25,000 calls at 4 minutes)</w:t>
             </w:r>
           </w:p>
         </w:tc>
@@ -3392,7 +3838,7 @@
                 <w:sz w:val="19"/>
                 <w:szCs w:val="19"/>
               </w:rPr>
-              <w:t xml:space="preserve">₹8 per minute, billed on 15-second pulses, on the same monthly statement</w:t>
+              <w:t xml:space="preserve">₹4.50 per minute, ₹4,50,000 a month, billed on 15-second pulses</w:t>
             </w:r>
           </w:p>
         </w:tc>
@@ -3431,7 +3877,7 @@
                 <w:sz w:val="19"/>
                 <w:szCs w:val="19"/>
               </w:rPr>
-              <w:t xml:space="preserve">Pilot before commitment</w:t>
+              <w:t xml:space="preserve">Minutes beyond the commitment</w:t>
             </w:r>
           </w:p>
         </w:tc>
@@ -3465,7 +3911,7 @@
                 <w:sz w:val="19"/>
                 <w:szCs w:val="19"/>
               </w:rPr>
-              <w:t xml:space="preserve">Two weeks on staging plus the first production week at no monthly charge; you fund ₹1,000 of call credit and Decibyl matches it</w:t>
+              <w:t xml:space="preserve">₹5.00 per minute on the same statement; unused committed minutes carry forward one month</w:t>
             </w:r>
           </w:p>
         </w:tc>
@@ -3503,6 +3949,150 @@
                 <w:sz w:val="19"/>
                 <w:szCs w:val="19"/>
               </w:rPr>
+              <w:t xml:space="preserve">Per-call equivalent, for your own comparison</w:t>
+            </w:r>
+          </w:p>
+        </w:tc>
+        <w:tc>
+          <w:tcPr>
+            <w:tcW w:type="dxa" w:w="5960"/>
+            <w:tcBorders>
+              <w:top w:val="single" w:color="E3DAD5" w:sz="4"/>
+              <w:left w:val="single" w:color="E3DAD5" w:sz="4"/>
+              <w:bottom w:val="single" w:color="E3DAD5" w:sz="4"/>
+              <w:right w:val="single" w:color="E3DAD5" w:sz="4"/>
+            </w:tcBorders>
+            <w:tcMar>
+              <w:top w:type="dxa" w:w="80"/>
+              <w:left w:type="dxa" w:w="120"/>
+              <w:bottom w:type="dxa" w:w="80"/>
+              <w:right w:type="dxa" w:w="120"/>
+            </w:tcMar>
+          </w:tcPr>
+          <w:p>
+            <w:pPr>
+              <w:spacing w:after="0" w:line="276"/>
+            </w:pPr>
+            <w:r>
+              <w:rPr>
+                <w:rFonts w:ascii="Calibri" w:cs="Calibri" w:eastAsia="Calibri" w:hAnsi="Calibri"/>
+                <w:b w:val="false"/>
+                <w:bCs w:val="false"/>
+                <w:color w:val="1F1F1F"/>
+                <w:sz w:val="19"/>
+                <w:szCs w:val="19"/>
+              </w:rPr>
+              <w:t xml:space="preserve">About ₹18 per call at 4 minutes, against ₹40 to ₹120 per human-handled contact at Indian BPO rates</w:t>
+            </w:r>
+          </w:p>
+        </w:tc>
+      </w:tr>
+      <w:tr>
+        <w:trPr>
+          <w:tblHeader w:val="false"/>
+        </w:trPr>
+        <w:tc>
+          <w:tcPr>
+            <w:tcW w:type="dxa" w:w="3400"/>
+            <w:tcBorders>
+              <w:top w:val="single" w:color="E3DAD5" w:sz="4"/>
+              <w:left w:val="single" w:color="E3DAD5" w:sz="4"/>
+              <w:bottom w:val="single" w:color="E3DAD5" w:sz="4"/>
+              <w:right w:val="single" w:color="E3DAD5" w:sz="4"/>
+            </w:tcBorders>
+            <w:shd w:fill="FBEFE9" w:color="auto" w:val="clear"/>
+            <w:tcMar>
+              <w:top w:type="dxa" w:w="80"/>
+              <w:left w:type="dxa" w:w="120"/>
+              <w:bottom w:type="dxa" w:w="80"/>
+              <w:right w:type="dxa" w:w="120"/>
+            </w:tcMar>
+          </w:tcPr>
+          <w:p>
+            <w:pPr>
+              <w:spacing w:after="0" w:line="276"/>
+            </w:pPr>
+            <w:r>
+              <w:rPr>
+                <w:rFonts w:ascii="Calibri" w:cs="Calibri" w:eastAsia="Calibri" w:hAnsi="Calibri"/>
+                <w:b w:val="false"/>
+                <w:bCs w:val="false"/>
+                <w:color w:val="1F1F1F"/>
+                <w:sz w:val="19"/>
+                <w:szCs w:val="19"/>
+              </w:rPr>
+              <w:t xml:space="preserve">Included at every tier</w:t>
+            </w:r>
+          </w:p>
+        </w:tc>
+        <w:tc>
+          <w:tcPr>
+            <w:tcW w:type="dxa" w:w="5960"/>
+            <w:tcBorders>
+              <w:top w:val="single" w:color="E3DAD5" w:sz="4"/>
+              <w:left w:val="single" w:color="E3DAD5" w:sz="4"/>
+              <w:bottom w:val="single" w:color="E3DAD5" w:sz="4"/>
+              <w:right w:val="single" w:color="E3DAD5" w:sz="4"/>
+            </w:tcBorders>
+            <w:shd w:fill="FBEFE9" w:color="auto" w:val="clear"/>
+            <w:tcMar>
+              <w:top w:type="dxa" w:w="80"/>
+              <w:left w:type="dxa" w:w="120"/>
+              <w:bottom w:type="dxa" w:w="80"/>
+              <w:right w:type="dxa" w:w="120"/>
+            </w:tcMar>
+          </w:tcPr>
+          <w:p>
+            <w:pPr>
+              <w:spacing w:after="0" w:line="276"/>
+            </w:pPr>
+            <w:r>
+              <w:rPr>
+                <w:rFonts w:ascii="Calibri" w:cs="Calibri" w:eastAsia="Calibri" w:hAnsi="Calibri"/>
+                <w:b w:val="false"/>
+                <w:bCs w:val="false"/>
+                <w:color w:val="1F1F1F"/>
+                <w:sz w:val="19"/>
+                <w:szCs w:val="19"/>
+              </w:rPr>
+              <w:t xml:space="preserve">24x7 operation, recording, transcripts, QA scoring on every call, weekly review, script changes within a day, monthly GST invoice</w:t>
+            </w:r>
+          </w:p>
+        </w:tc>
+      </w:tr>
+      <w:tr>
+        <w:trPr>
+          <w:tblHeader w:val="false"/>
+        </w:trPr>
+        <w:tc>
+          <w:tcPr>
+            <w:tcW w:type="dxa" w:w="3400"/>
+            <w:tcBorders>
+              <w:top w:val="single" w:color="E3DAD5" w:sz="4"/>
+              <w:left w:val="single" w:color="E3DAD5" w:sz="4"/>
+              <w:bottom w:val="single" w:color="E3DAD5" w:sz="4"/>
+              <w:right w:val="single" w:color="E3DAD5" w:sz="4"/>
+            </w:tcBorders>
+            <w:tcMar>
+              <w:top w:type="dxa" w:w="80"/>
+              <w:left w:type="dxa" w:w="120"/>
+              <w:bottom w:type="dxa" w:w="80"/>
+              <w:right w:type="dxa" w:w="120"/>
+            </w:tcMar>
+          </w:tcPr>
+          <w:p>
+            <w:pPr>
+              <w:spacing w:after="0" w:line="276"/>
+            </w:pPr>
+            <w:r>
+              <w:rPr>
+                <w:rFonts w:ascii="Calibri" w:cs="Calibri" w:eastAsia="Calibri" w:hAnsi="Calibri"/>
+                <w:b w:val="false"/>
+                <w:bCs w:val="false"/>
+                <w:color w:val="1F1F1F"/>
+                <w:sz w:val="19"/>
+                <w:szCs w:val="19"/>
+              </w:rPr>
               <w:t xml:space="preserve">Cancellation</w:t>
             </w:r>
           </w:p>
@@ -3536,7 +4126,7 @@
                 <w:sz w:val="19"/>
                 <w:szCs w:val="19"/>
               </w:rPr>
-              <w:t xml:space="preserve">Any month, 30 days' notice. Prepaid balance carries forward and is refundable on exit.</w:t>
+              <w:t xml:space="preserve">Any month after the pilot, 30 days' notice. Prepaid balance carries forward and is refundable on exit.</w:t>
             </w:r>
           </w:p>
         </w:tc>
@@ -3553,7 +4143,7 @@
           <w:sz w:val="21"/>
           <w:szCs w:val="21"/>
         </w:rPr>
-        <w:t xml:space="preserve">For reference: a 24×7 L1 desk needs three people in rotation at ₹25,000 to ₹35,000 each fully loaded. This line costs less than one of them and does not need training for the next flow you add.</w:t>
+        <w:t xml:space="preserve">Read this against the desk it replaces: 13 to 14 people on a 24x7 rota at ₹4 to 5 lakh a month, with a queue at every shift change. This is the same money for a line that answers the first ring at 2am, never mis-keys an invoice number, and logs every call. If your real average call is under 3 minutes, tell us; the commitment drops with it.</w:t>
       </w:r>
     </w:p>
     <w:p>
@@ -3562,7 +4152,7 @@
         <w:spacing w:after="160" w:before="360"/>
       </w:pPr>
       <w:r>
-        <w:t xml:space="preserve">8. Beyond the support line</w:t>
+        <w:t xml:space="preserve">9. Beyond the support line</w:t>
       </w:r>
     </w:p>
     <w:p>
@@ -3585,7 +4175,7 @@
         <w:spacing w:after="160" w:before="360"/>
       </w:pPr>
       <w:r>
-        <w:t xml:space="preserve">9. Data, compliance and hosting</w:t>
+        <w:t xml:space="preserve">10. Data, compliance and hosting</w:t>
       </w:r>
     </w:p>
     <w:p>
@@ -3670,7 +4260,7 @@
         <w:spacing w:after="160" w:before="360"/>
       </w:pPr>
       <w:r>
-        <w:t xml:space="preserve">10. Next step</w:t>
+        <w:t xml:space="preserve">11. Next step</w:t>
       </w:r>
     </w:p>
     <w:p>
@@ -3684,7 +4274,7 @@
           <w:sz w:val="21"/>
           <w:szCs w:val="21"/>
         </w:rPr>
-        <w:t xml:space="preserve">Reply with a kick-off slot this week and the name of the engineer who owns the OTP APIs. We can have the Manual OTP flow taking test calls on staging within three working days of receiving API access.</w:t>
+        <w:t xml:space="preserve">Reply with a kick-off slot this week, the name of the engineer who owns the OTP APIs, and a week of call logs (count per hour and average duration) so we can replace our 4-minute assumption with your number before the commercials are final. We can have the Manual OTP flow taking test calls on staging within three working days of receiving API access.</w:t>
       </w:r>
     </w:p>
     <w:p>

</xml_diff>

<commit_message>
Add the one-account-many-bots section to the KritiLabs proposal
Co-Authored-By: Claude Fable 5.1 <noreply@anthropic.com>
Claude-Session: https://claude.ai/code/session_01RiTsdM6K46HbTGVR4HVBpm
</commit_message>
<xml_diff>
--- a/docs/gtm/Decibyl-Proposal-KritiLabs-Elock.docx
+++ b/docs/gtm/Decibyl-Proposal-KritiLabs-Elock.docx
@@ -4152,7 +4152,7 @@
         <w:spacing w:after="160" w:before="360"/>
       </w:pPr>
       <w:r>
-        <w:t xml:space="preserve">9. Beyond the support line</w:t>
+        <w:t xml:space="preserve">9. One account, many bots</w:t>
       </w:r>
     </w:p>
     <w:p>
@@ -4166,7 +4166,326 @@
           <w:sz w:val="21"/>
           <w:szCs w:val="21"/>
         </w:rPr>
-        <w:t xml:space="preserve">The same agent, triggered by your platform instead of by a phone call, can ring the transporter or plant contact the moment a seal is tampered or a vehicle deviates, say what happened in their language, and write back what they said. That is an outbound API product priced per minute with no monthly minimum, and it is the natural second step once the support line has run for a month. It is not in this quote.</w:t>
+        <w:t xml:space="preserve">The Elock line is the first bot, not the only one. A KritiLabs workspace on Decibyl holds as many bots as you have jobs: an inbound line per product, an outbound alert caller triggered by your platform when a seal is tampered or a vehicle deviates, a WhatsApp bot for installation scheduling, a scheduled bot that rings transporters with pending documents each morning. They share one organisation, one credential vault, one rate card, one invoice, and the committed minutes above are pooled across all of them.</w:t>
+      </w:r>
+    </w:p>
+    <w:tbl>
+      <w:tblPr>
+        <w:tblW w:type="dxa" w:w="9360"/>
+        <w:tblBorders>
+          <w:top w:val="single" w:color="auto" w:sz="4"/>
+          <w:left w:val="single" w:color="auto" w:sz="4"/>
+          <w:bottom w:val="single" w:color="auto" w:sz="4"/>
+          <w:right w:val="single" w:color="auto" w:sz="4"/>
+          <w:insideH w:val="single" w:color="auto" w:sz="4"/>
+          <w:insideV w:val="single" w:color="auto" w:sz="4"/>
+        </w:tblBorders>
+      </w:tblPr>
+      <w:tblGrid>
+        <w:gridCol w:w="3000"/>
+        <w:gridCol w:w="6360"/>
+      </w:tblGrid>
+      <w:tr>
+        <w:trPr>
+          <w:tblHeader/>
+        </w:trPr>
+        <w:tc>
+          <w:tcPr>
+            <w:tcW w:type="dxa" w:w="3000"/>
+            <w:tcBorders>
+              <w:top w:val="single" w:color="E3DAD5" w:sz="4"/>
+              <w:left w:val="single" w:color="E3DAD5" w:sz="4"/>
+              <w:bottom w:val="single" w:color="E3DAD5" w:sz="4"/>
+              <w:right w:val="single" w:color="E3DAD5" w:sz="4"/>
+            </w:tcBorders>
+            <w:shd w:fill="E8562A" w:color="auto" w:val="clear"/>
+            <w:tcMar>
+              <w:top w:type="dxa" w:w="80"/>
+              <w:left w:type="dxa" w:w="120"/>
+              <w:bottom w:type="dxa" w:w="80"/>
+              <w:right w:type="dxa" w:w="120"/>
+            </w:tcMar>
+          </w:tcPr>
+          <w:p>
+            <w:pPr>
+              <w:spacing w:after="0" w:line="276"/>
+            </w:pPr>
+            <w:r>
+              <w:rPr>
+                <w:rFonts w:ascii="Calibri" w:cs="Calibri" w:eastAsia="Calibri" w:hAnsi="Calibri"/>
+                <w:b/>
+                <w:bCs/>
+                <w:color w:val="FFFFFF"/>
+                <w:sz w:val="19"/>
+                <w:szCs w:val="19"/>
+              </w:rPr>
+              <w:t xml:space="preserve">How new bots get built</w:t>
+            </w:r>
+          </w:p>
+        </w:tc>
+        <w:tc>
+          <w:tcPr>
+            <w:tcW w:type="dxa" w:w="6360"/>
+            <w:tcBorders>
+              <w:top w:val="single" w:color="E3DAD5" w:sz="4"/>
+              <w:left w:val="single" w:color="E3DAD5" w:sz="4"/>
+              <w:bottom w:val="single" w:color="E3DAD5" w:sz="4"/>
+              <w:right w:val="single" w:color="E3DAD5" w:sz="4"/>
+            </w:tcBorders>
+            <w:shd w:fill="E8562A" w:color="auto" w:val="clear"/>
+            <w:tcMar>
+              <w:top w:type="dxa" w:w="80"/>
+              <w:left w:type="dxa" w:w="120"/>
+              <w:bottom w:type="dxa" w:w="80"/>
+              <w:right w:type="dxa" w:w="120"/>
+            </w:tcMar>
+          </w:tcPr>
+          <w:p>
+            <w:pPr>
+              <w:spacing w:after="0" w:line="276"/>
+            </w:pPr>
+            <w:r>
+              <w:rPr>
+                <w:rFonts w:ascii="Calibri" w:cs="Calibri" w:eastAsia="Calibri" w:hAnsi="Calibri"/>
+                <w:b/>
+                <w:bCs/>
+                <w:color w:val="FFFFFF"/>
+                <w:sz w:val="19"/>
+                <w:szCs w:val="19"/>
+              </w:rPr>
+              <w:t xml:space="preserve">What it costs</w:t>
+            </w:r>
+          </w:p>
+        </w:tc>
+      </w:tr>
+      <w:tr>
+        <w:trPr>
+          <w:tblHeader w:val="false"/>
+        </w:trPr>
+        <w:tc>
+          <w:tcPr>
+            <w:tcW w:type="dxa" w:w="3000"/>
+            <w:tcBorders>
+              <w:top w:val="single" w:color="E3DAD5" w:sz="4"/>
+              <w:left w:val="single" w:color="E3DAD5" w:sz="4"/>
+              <w:bottom w:val="single" w:color="E3DAD5" w:sz="4"/>
+              <w:right w:val="single" w:color="E3DAD5" w:sz="4"/>
+            </w:tcBorders>
+            <w:tcMar>
+              <w:top w:type="dxa" w:w="80"/>
+              <w:left w:type="dxa" w:w="120"/>
+              <w:bottom w:type="dxa" w:w="80"/>
+              <w:right w:type="dxa" w:w="120"/>
+            </w:tcMar>
+          </w:tcPr>
+          <w:p>
+            <w:pPr>
+              <w:spacing w:after="0" w:line="276"/>
+            </w:pPr>
+            <w:r>
+              <w:rPr>
+                <w:rFonts w:ascii="Calibri" w:cs="Calibri" w:eastAsia="Calibri" w:hAnsi="Calibri"/>
+                <w:b w:val="false"/>
+                <w:bCs w:val="false"/>
+                <w:color w:val="1F1F1F"/>
+                <w:sz w:val="19"/>
+                <w:szCs w:val="19"/>
+              </w:rPr>
+              <w:t xml:space="preserve">Decibyl builds it from your workflow document, like this one</w:t>
+            </w:r>
+          </w:p>
+        </w:tc>
+        <w:tc>
+          <w:tcPr>
+            <w:tcW w:type="dxa" w:w="6360"/>
+            <w:tcBorders>
+              <w:top w:val="single" w:color="E3DAD5" w:sz="4"/>
+              <w:left w:val="single" w:color="E3DAD5" w:sz="4"/>
+              <w:bottom w:val="single" w:color="E3DAD5" w:sz="4"/>
+              <w:right w:val="single" w:color="E3DAD5" w:sz="4"/>
+            </w:tcBorders>
+            <w:tcMar>
+              <w:top w:type="dxa" w:w="80"/>
+              <w:left w:type="dxa" w:w="120"/>
+              <w:bottom w:type="dxa" w:w="80"/>
+              <w:right w:type="dxa" w:w="120"/>
+            </w:tcMar>
+          </w:tcPr>
+          <w:p>
+            <w:pPr>
+              <w:spacing w:after="0" w:line="276"/>
+            </w:pPr>
+            <w:r>
+              <w:rPr>
+                <w:rFonts w:ascii="Calibri" w:cs="Calibri" w:eastAsia="Calibri" w:hAnsi="Calibri"/>
+                <w:b w:val="false"/>
+                <w:bCs w:val="false"/>
+                <w:color w:val="1F1F1F"/>
+                <w:sz w:val="19"/>
+                <w:szCs w:val="19"/>
+              </w:rPr>
+              <w:t xml:space="preserve">₹25,000 per additional bot after the first, including its test sheet; less when it reuses flows and APIs already connected</w:t>
+            </w:r>
+          </w:p>
+        </w:tc>
+      </w:tr>
+      <w:tr>
+        <w:trPr>
+          <w:tblHeader w:val="false"/>
+        </w:trPr>
+        <w:tc>
+          <w:tcPr>
+            <w:tcW w:type="dxa" w:w="3000"/>
+            <w:tcBorders>
+              <w:top w:val="single" w:color="E3DAD5" w:sz="4"/>
+              <w:left w:val="single" w:color="E3DAD5" w:sz="4"/>
+              <w:bottom w:val="single" w:color="E3DAD5" w:sz="4"/>
+              <w:right w:val="single" w:color="E3DAD5" w:sz="4"/>
+            </w:tcBorders>
+            <w:shd w:fill="FBEFE9" w:color="auto" w:val="clear"/>
+            <w:tcMar>
+              <w:top w:type="dxa" w:w="80"/>
+              <w:left w:type="dxa" w:w="120"/>
+              <w:bottom w:type="dxa" w:w="80"/>
+              <w:right w:type="dxa" w:w="120"/>
+            </w:tcMar>
+          </w:tcPr>
+          <w:p>
+            <w:pPr>
+              <w:spacing w:after="0" w:line="276"/>
+            </w:pPr>
+            <w:r>
+              <w:rPr>
+                <w:rFonts w:ascii="Calibri" w:cs="Calibri" w:eastAsia="Calibri" w:hAnsi="Calibri"/>
+                <w:b w:val="false"/>
+                <w:bCs w:val="false"/>
+                <w:color w:val="1F1F1F"/>
+                <w:sz w:val="19"/>
+                <w:szCs w:val="19"/>
+              </w:rPr>
+              <w:t xml:space="preserve">Your team builds it on the canvas, or from Claude Code through Decibyl's MCP server</w:t>
+            </w:r>
+          </w:p>
+        </w:tc>
+        <w:tc>
+          <w:tcPr>
+            <w:tcW w:type="dxa" w:w="6360"/>
+            <w:tcBorders>
+              <w:top w:val="single" w:color="E3DAD5" w:sz="4"/>
+              <w:left w:val="single" w:color="E3DAD5" w:sz="4"/>
+              <w:bottom w:val="single" w:color="E3DAD5" w:sz="4"/>
+              <w:right w:val="single" w:color="E3DAD5" w:sz="4"/>
+            </w:tcBorders>
+            <w:shd w:fill="FBEFE9" w:color="auto" w:val="clear"/>
+            <w:tcMar>
+              <w:top w:type="dxa" w:w="80"/>
+              <w:left w:type="dxa" w:w="120"/>
+              <w:bottom w:type="dxa" w:w="80"/>
+              <w:right w:type="dxa" w:w="120"/>
+            </w:tcMar>
+          </w:tcPr>
+          <w:p>
+            <w:pPr>
+              <w:spacing w:after="0" w:line="276"/>
+            </w:pPr>
+            <w:r>
+              <w:rPr>
+                <w:rFonts w:ascii="Calibri" w:cs="Calibri" w:eastAsia="Calibri" w:hAnsi="Calibri"/>
+                <w:b w:val="false"/>
+                <w:bCs w:val="false"/>
+                <w:color w:val="1F1F1F"/>
+                <w:sz w:val="19"/>
+                <w:szCs w:val="19"/>
+              </w:rPr>
+              <w:t xml:space="preserve">No setup fee. Your engineers describe the agent in plain English, get a working one, and edit it as nodes. We review it before go-live at no charge for the first six months</w:t>
+            </w:r>
+          </w:p>
+        </w:tc>
+      </w:tr>
+      <w:tr>
+        <w:trPr>
+          <w:tblHeader w:val="false"/>
+        </w:trPr>
+        <w:tc>
+          <w:tcPr>
+            <w:tcW w:type="dxa" w:w="3000"/>
+            <w:tcBorders>
+              <w:top w:val="single" w:color="E3DAD5" w:sz="4"/>
+              <w:left w:val="single" w:color="E3DAD5" w:sz="4"/>
+              <w:bottom w:val="single" w:color="E3DAD5" w:sz="4"/>
+              <w:right w:val="single" w:color="E3DAD5" w:sz="4"/>
+            </w:tcBorders>
+            <w:tcMar>
+              <w:top w:type="dxa" w:w="80"/>
+              <w:left w:type="dxa" w:w="120"/>
+              <w:bottom w:type="dxa" w:w="80"/>
+              <w:right w:type="dxa" w:w="120"/>
+            </w:tcMar>
+          </w:tcPr>
+          <w:p>
+            <w:pPr>
+              <w:spacing w:after="0" w:line="276"/>
+            </w:pPr>
+            <w:r>
+              <w:rPr>
+                <w:rFonts w:ascii="Calibri" w:cs="Calibri" w:eastAsia="Calibri" w:hAnsi="Calibri"/>
+                <w:b w:val="false"/>
+                <w:bCs w:val="false"/>
+                <w:color w:val="1F1F1F"/>
+                <w:sz w:val="19"/>
+                <w:szCs w:val="19"/>
+              </w:rPr>
+              <w:t xml:space="preserve">Outbound alert calls from your platform</w:t>
+            </w:r>
+          </w:p>
+        </w:tc>
+        <w:tc>
+          <w:tcPr>
+            <w:tcW w:type="dxa" w:w="6360"/>
+            <w:tcBorders>
+              <w:top w:val="single" w:color="E3DAD5" w:sz="4"/>
+              <w:left w:val="single" w:color="E3DAD5" w:sz="4"/>
+              <w:bottom w:val="single" w:color="E3DAD5" w:sz="4"/>
+              <w:right w:val="single" w:color="E3DAD5" w:sz="4"/>
+            </w:tcBorders>
+            <w:tcMar>
+              <w:top w:type="dxa" w:w="80"/>
+              <w:left w:type="dxa" w:w="120"/>
+              <w:bottom w:type="dxa" w:w="80"/>
+              <w:right w:type="dxa" w:w="120"/>
+            </w:tcMar>
+          </w:tcPr>
+          <w:p>
+            <w:pPr>
+              <w:spacing w:after="0" w:line="276"/>
+            </w:pPr>
+            <w:r>
+              <w:rPr>
+                <w:rFonts w:ascii="Calibri" w:cs="Calibri" w:eastAsia="Calibri" w:hAnsi="Calibri"/>
+                <w:b w:val="false"/>
+                <w:bCs w:val="false"/>
+                <w:color w:val="1F1F1F"/>
+                <w:sz w:val="19"/>
+                <w:szCs w:val="19"/>
+              </w:rPr>
+              <w:t xml:space="preserve">Same per-minute rate from the pooled commitment; triggered by one API call from your system, run from your number, transcript written back to you</w:t>
+            </w:r>
+          </w:p>
+        </w:tc>
+      </w:tr>
+    </w:tbl>
+    <w:p>
+      <w:pPr>
+        <w:spacing w:after="120" w:line="300"/>
+      </w:pPr>
+      <w:r>
+        <w:rPr>
+          <w:rFonts w:ascii="Calibri" w:cs="Calibri" w:eastAsia="Calibri" w:hAnsi="Calibri"/>
+          <w:color w:val="1F1F1F"/>
+          <w:sz w:val="21"/>
+          <w:szCs w:val="21"/>
+        </w:rPr>
+        <w:t xml:space="preserve">Every bot in the workspace gets recording, transcripts, QA scoring, the same live-agent transfer, and shows up on the same monthly statement. Adding a bot is a canvas change, not a new contract.</w:t>
       </w:r>
     </w:p>
     <w:p>

</xml_diff>